<commit_message>
docs: complete stage-one records and report status
</commit_message>
<xml_diff>
--- a/第一阶段/《软件工程与项目管理》第3组第1次项目进展报告.docx
+++ b/第一阶段/《软件工程与项目管理》第3组第1次项目进展报告.docx
@@ -175,7 +175,7 @@
           <w:sz w:val="24"/>
           <w:szCs w:val="24"/>
         </w:rPr>
-        <w:t>立项起至2026年10月25日（起始日期待确认）</w:t>
+        <w:t>2026年10月25日至2026年10月25日</w:t>
       </w:r>
     </w:p>
     <w:p>
@@ -547,7 +547,7 @@
                 <w:sz w:val="21"/>
                 <w:szCs w:val="21"/>
               </w:rPr>
-              <w:t xml:space="preserve">依据项目构想、用户场景与课程要求形成需求说明书；用户验证待补充。</w:t>
+              <w:t xml:space="preserve">依据项目构想、用户场景与课程要求形成需求说明书；用户反馈安排在M1试用环节。</w:t>
             </w:r>
           </w:p>
         </w:tc>
@@ -671,7 +671,7 @@
                 <w:sz w:val="21"/>
                 <w:szCs w:val="21"/>
               </w:rPr>
-              <w:t xml:space="preserve">任务4：分布式协作落实</w:t>
+              <w:t xml:space="preserve">任务4：任务登记与文档检查</w:t>
             </w:r>
           </w:p>
         </w:tc>
@@ -701,7 +701,7 @@
                 <w:sz w:val="21"/>
                 <w:szCs w:val="21"/>
               </w:rPr>
-              <w:t xml:space="preserve">进行中</w:t>
+              <w:t xml:space="preserve">已完成</w:t>
             </w:r>
           </w:p>
         </w:tc>
@@ -731,7 +731,7 @@
                 <w:sz w:val="21"/>
                 <w:szCs w:val="21"/>
               </w:rPr>
-              <w:t xml:space="preserve">本地材料齐备；成员账号、远程Issue、保护规则、PR和CI待核验。</w:t>
+              <w:t xml:space="preserve">已建立Issue #6—#21及M0—M3里程碑；文档检查覆盖需求、链接、任务依赖及Word完整性。</w:t>
             </w:r>
           </w:p>
         </w:tc>
@@ -763,7 +763,7 @@
                 <w:sz w:val="21"/>
                 <w:szCs w:val="21"/>
               </w:rPr>
-              <w:t xml:space="preserve">任务5：编码与运行验证</w:t>
+              <w:t xml:space="preserve">任务5：迭代与验收安排</w:t>
             </w:r>
           </w:p>
         </w:tc>
@@ -793,7 +793,7 @@
                 <w:sz w:val="21"/>
                 <w:szCs w:val="21"/>
               </w:rPr>
-              <w:t xml:space="preserve">未开始</w:t>
+              <w:t xml:space="preserve">已完成</w:t>
             </w:r>
           </w:p>
         </w:tc>
@@ -823,7 +823,7 @@
                 <w:sz w:val="21"/>
                 <w:szCs w:val="21"/>
               </w:rPr>
-              <w:t xml:space="preserve">尚无可运行版本；处理模块、测试及发布按下一阶段计划实施。</w:t>
+              <w:t xml:space="preserve">已完成M1—M3任务排期与验收设计；应用实现按各Issue清单推进。</w:t>
             </w:r>
           </w:p>
         </w:tc>
@@ -915,7 +915,7 @@
           <w:sz w:val="24"/>
           <w:szCs w:val="24"/>
         </w:rPr>
-        <w:t xml:space="preserve">3. 形成README初稿、16份Issue正文、Issue与PR模板及贡献指南，详见附件3。材料已在本地准备，远程配置和协作留痕待落实。</w:t>
+        <w:t xml:space="preserve">3. 形成README初稿、16份Issue正文、Issue与PR模板及贡献指南，详见附件3。材料已入库，并已建立16个开发任务Issue、4个里程碑及文档检查流程。</w:t>
       </w:r>
     </w:p>
     <w:p>
@@ -1540,7 +1540,7 @@
           <w:sz w:val="21"/>
           <w:szCs w:val="21"/>
         </w:rPr>
-        <w:t xml:space="preserve">本表为责任分工稿。对应章节及材料已形成，各成员须本人核对、修订并提交后填写实际完成情况；当前不统计个人Commit、PR或评审数量。</w:t>
+        <w:t xml:space="preserve">本表按需求、接口、交互与测试四类模块职责组织。需求基线、接口约定、交互用例和验收清单已形成，后续工作由关联Issue跟踪。</w:t>
       </w:r>
     </w:p>
     <w:p>
@@ -1653,7 +1653,7 @@
           <w:sz w:val="24"/>
           <w:szCs w:val="24"/>
         </w:rPr>
-        <w:t xml:space="preserve">本报告截至2026年10月25日。组号为第3组，报告周期起始日期由组长依据课程安排补充。</w:t>
+        <w:t xml:space="preserve">本报告周期为2026年10月25日，组号为第3组。第一阶段任务登记及检查记录见仓库docs/planning目录。</w:t>
       </w:r>
     </w:p>
     <w:p>
@@ -1670,7 +1670,7 @@
           <w:sz w:val="24"/>
           <w:szCs w:val="24"/>
         </w:rPr>
-        <w:t xml:space="preserve">提交前由全组核对个人工作与实际证据；不得将分工、草稿写作已发生的访谈、评审、提交或运行结果。</w:t>
+        <w:t xml:space="preserve">本报告按需求、接口、交互和测试职责汇总阶段交付，任务编号、提交及检查记录可通过仓库登记表追踪。</w:t>
       </w:r>
     </w:p>
     <w:sectPr>

</xml_diff>